<commit_message>
Ajoute le pied de page au papier à en-tête BEDA FER ET ALU
Co-Authored-By: Claude Sonnet 5.5 <noreply@anthropic.com>
Claude-Session: https://claude.ai/code/session_01HgYHGoUxTitHJNmQpJt68B
</commit_message>
<xml_diff>
--- a/docs/PAPIER_ENTETE_VIERGE.docx
+++ b/docs/PAPIER_ENTETE_VIERGE.docx
@@ -27,6 +27,7 @@
     </w:p>
     <w:sectPr>
       <w:headerReference w:type="default" r:id="rId6"/>
+      <w:footerReference w:type="default" r:id="rId20"/>
       <w:pgSz w:w="11906" w:h="16838"/>
       <w:pgMar w:top="1417" w:right="1417" w:bottom="1417" w:left="1417" w:header="708" w:footer="708" w:gutter="0"/>
       <w:cols w:space="708"/>
@@ -59,6 +60,92 @@
     </w:p>
   </w:endnote>
 </w:endnotes>
+</file>
+
+<file path=word/footer1.xml><?xml version="1.0" encoding="utf-8"?>
+<w:ftr xmlns:wpc="http://schemas.microsoft.com/office/word/2010/wordprocessingCanvas" xmlns:cx="http://schemas.microsoft.com/office/drawing/2014/chartex" xmlns:cx1="http://schemas.microsoft.com/office/drawing/2015/9/8/chartex" xmlns:cx2="http://schemas.microsoft.com/office/drawing/2015/10/21/chartex" xmlns:cx3="http://schemas.microsoft.com/office/drawing/2016/5/9/chartex" xmlns:cx4="http://schemas.microsoft.com/office/drawing/2016/5/10/chartex" xmlns:cx5="http://schemas.microsoft.com/office/drawing/2016/5/11/chartex" xmlns:cx6="http://schemas.microsoft.com/office/drawing/2016/5/12/chartex" xmlns:cx7="http://schemas.microsoft.com/office/drawing/2016/5/13/chartex" xmlns:cx8="http://schemas.microsoft.com/office/drawing/2016/5/14/chartex" xmlns:mc="http://schemas.openxmlformats.org/markup-compatibility/2006" xmlns:aink="http://schemas.microsoft.com/office/drawing/2016/ink" xmlns:am3d="http://schemas.microsoft.com/office/drawing/2017/model3d" xmlns:o="urn:schemas-microsoft-com:office:office" xmlns:oel="http://schemas.microsoft.com/office/2019/extlst" xmlns:r="http://schemas.openxmlformats.org/officeDocument/2006/relationships" xmlns:m="http://schemas.openxmlformats.org/officeDocument/2006/math" xmlns:v="urn:schemas-microsoft-com:vml" xmlns:wp14="http://schemas.microsoft.com/office/word/2010/wordprocessingDrawing" xmlns:wp="http://schemas.openxmlformats.org/drawingml/2006/wordprocessingDrawing" xmlns:w10="urn:schemas-microsoft-com:office:word" xmlns:w="http://schemas.openxmlformats.org/wordprocessingml/2006/main" xmlns:w14="http://schemas.microsoft.com/office/word/2010/wordml" xmlns:w15="http://schemas.microsoft.com/office/word/2012/wordml" xmlns:w16cex="http://schemas.microsoft.com/office/word/2018/wordml/cex" xmlns:w16cid="http://schemas.microsoft.com/office/word/2016/wordml/cid" xmlns:w16="http://schemas.microsoft.com/office/word/2018/wordml" xmlns:w16du="http://schemas.microsoft.com/office/word/2023/wordml/word16du" xmlns:w16sdtdh="http://schemas.microsoft.com/office/word/2020/wordml/sdtdatahash" xmlns:w16sdtfl="http://schemas.microsoft.com/office/word/2024/wordml/sdtformatlock" xmlns:w16se="http://schemas.microsoft.com/office/word/2015/wordml/symex" xmlns:wpg="http://schemas.microsoft.com/office/word/2010/wordprocessingGroup" xmlns:wpi="http://schemas.microsoft.com/office/word/2010/wordprocessingInk" xmlns:wne="http://schemas.microsoft.com/office/word/2006/wordml" xmlns:wps="http://schemas.microsoft.com/office/word/2010/wordprocessingShape" mc:Ignorable="w14 w15 w16se w16cid w16 w16cex w16sdtdh w16sdtfl w16du wp14">
+  <w:p>
+    <w:pPr>
+      <w:pBdr>
+        <w:top w:val="single" w:sz="6" w:space="1" w:color="2E75B6"/>
+      </w:pBdr>
+      <w:spacing w:after="40" w:line="240" w:lineRule="auto"/>
+      <w:jc w:val="right"/>
+    </w:pPr>
+    <w:r>
+      <w:rPr>
+        <w:rFonts w:ascii="Calibri" w:hAnsi="Calibri"/>
+        <w:color w:val="2B3180"/>
+        <w:sz w:val="10"/>
+      </w:rPr>
+      <w:t>BEDA FER ET ALU</w:t>
+    </w:r>
+  </w:p>
+  <w:p>
+    <w:pPr>
+      <w:pStyle w:val="Pieddepage"/>
+      <w:spacing w:after="0" w:line="240" w:lineRule="auto"/>
+      <w:jc w:val="center"/>
+    </w:pPr>
+    <w:r>
+      <w:rPr>
+        <w:rFonts w:ascii="Calibri" w:hAnsi="Calibri"/>
+        <w:color w:val="2E75B6"/>
+        <w:sz w:val="18"/>
+        <w:szCs w:val="18"/>
+      </w:rPr>
+      <w:t>OPTEZ POUR LE PROFESSIONNALISME</w:t>
+    </w:r>
+  </w:p>
+  <w:p>
+    <w:pPr>
+      <w:pStyle w:val="Pieddepage"/>
+      <w:spacing w:after="0" w:line="240" w:lineRule="auto"/>
+      <w:jc w:val="center"/>
+    </w:pPr>
+    <w:r>
+      <w:rPr>
+        <w:rFonts w:ascii="Calibri" w:hAnsi="Calibri"/>
+        <w:color w:val="404040"/>
+        <w:sz w:val="18"/>
+        <w:szCs w:val="18"/>
+      </w:rPr>
+      <w:t xml:space="preserve">Nouveau goudron route d’abatta tel : (225) 27 21 37 09 73 – cel : 07 47 08 54 54</w:t>
+    </w:r>
+  </w:p>
+  <w:p>
+    <w:pPr>
+      <w:pStyle w:val="Pieddepage"/>
+      <w:spacing w:after="0" w:line="240" w:lineRule="auto"/>
+      <w:jc w:val="center"/>
+    </w:pPr>
+    <w:r>
+      <w:rPr>
+        <w:rFonts w:ascii="Calibri" w:hAnsi="Calibri"/>
+        <w:color w:val="404040"/>
+        <w:sz w:val="18"/>
+        <w:szCs w:val="18"/>
+      </w:rPr>
+      <w:t xml:space="preserve">Showroom river center leader price riviera  tel : (225) 25 22 009 130</w:t>
+    </w:r>
+  </w:p>
+  <w:p>
+    <w:pPr>
+      <w:pStyle w:val="Pieddepage"/>
+      <w:spacing w:after="0" w:line="240" w:lineRule="auto"/>
+      <w:jc w:val="center"/>
+    </w:pPr>
+    <w:r>
+      <w:rPr>
+        <w:rFonts w:ascii="Calibri" w:hAnsi="Calibri"/>
+        <w:color w:val="404040"/>
+        <w:sz w:val="18"/>
+        <w:szCs w:val="18"/>
+      </w:rPr>
+      <w:t xml:space="preserve">CI-ABJ-2019-B-00651 / 28 BP 1204 ABJ 28 / www.bedalu.com / info@bedalu.com</w:t>
+    </w:r>
+  </w:p>
+</w:ftr>
 </file>
 
 <file path=word/footnotes.xml><?xml version="1.0" encoding="utf-8"?>

</xml_diff>